<commit_message>
chore: 同步 core/crypto.py, core/selftest_web.py, core/webserver.py, tools/run_all_tests.py, 使用说明.md, 使用说明.docx, 详细测试报告_20261026.md, 详细测试报告_20261026.docx
</commit_message>
<xml_diff>
--- a/使用说明.docx
+++ b/使用说明.docx
@@ -1662,7 +1662,7 @@
           <w:b w:val="0"/>
           <w:sz w:val="21"/>
         </w:rPr>
-        <w:t>（约 10 分钟，10 个套件各自独立进程，</w:t>
+        <w:t>（约 13 分钟，13 个套件各自独立进程，</w:t>
       </w:r>
     </w:p>
     <w:p>
@@ -1675,7 +1675,7 @@
           <w:b w:val="0"/>
           <w:sz w:val="21"/>
         </w:rPr>
-        <w:t>某个崩了不影响其它）。当前 10 个套件：</w:t>
+        <w:t>某个崩了不影响其它）。当前 13 个套件：</w:t>
       </w:r>
     </w:p>
     <w:p/>
@@ -2307,6 +2307,191 @@
           </w:p>
         </w:tc>
       </w:tr>
+      <w:tr>
+        <w:tc>
+          <w:tcPr>
+            <w:tcW w:type="dxa" w:w="2880"/>
+          </w:tcPr>
+          <w:p>
+            <w:pPr>
+              <w:spacing w:after="20"/>
+            </w:pPr>
+            <w:r>
+              <w:rPr>
+                <w:rFonts w:ascii="微软雅黑" w:hAnsi="微软雅黑" w:eastAsia="微软雅黑"/>
+                <w:b w:val="0"/>
+                <w:sz w:val="19"/>
+              </w:rPr>
+              <w:t>实战集成</w:t>
+            </w:r>
+          </w:p>
+        </w:tc>
+        <w:tc>
+          <w:tcPr>
+            <w:tcW w:type="dxa" w:w="2880"/>
+          </w:tcPr>
+          <w:p>
+            <w:pPr>
+              <w:spacing w:after="20"/>
+            </w:pPr>
+            <w:r>
+              <w:rPr>
+                <w:rFonts w:ascii="微软雅黑" w:hAnsi="微软雅黑" w:eastAsia="微软雅黑"/>
+                <w:b w:val="0"/>
+                <w:sz w:val="19"/>
+              </w:rPr>
+              <w:t xml:space="preserve">走 </w:t>
+            </w:r>
+            <w:r>
+              <w:rPr>
+                <w:rFonts w:ascii="Consolas" w:hAnsi="Consolas" w:eastAsia="Consolas"/>
+                <w:b w:val="0"/>
+                <w:color w:val="C7254E"/>
+                <w:sz w:val="17"/>
+              </w:rPr>
+              <w:t>runner.run</w:t>
+            </w:r>
+            <w:r>
+              <w:rPr>
+                <w:rFonts w:ascii="微软雅黑" w:hAnsi="微软雅黑" w:eastAsia="微软雅黑"/>
+                <w:b w:val="0"/>
+                <w:sz w:val="19"/>
+              </w:rPr>
+              <w:t xml:space="preserve"> 的集成链路</w:t>
+            </w:r>
+          </w:p>
+        </w:tc>
+        <w:tc>
+          <w:tcPr>
+            <w:tcW w:type="dxa" w:w="2880"/>
+          </w:tcPr>
+          <w:p>
+            <w:pPr>
+              <w:spacing w:after="20"/>
+            </w:pPr>
+            <w:r>
+              <w:rPr>
+                <w:rFonts w:ascii="微软雅黑" w:hAnsi="微软雅黑" w:eastAsia="微软雅黑"/>
+                <w:b w:val="0"/>
+                <w:sz w:val="19"/>
+              </w:rPr>
+              <w:t>61</w:t>
+            </w:r>
+          </w:p>
+        </w:tc>
+      </w:tr>
+      <w:tr>
+        <w:tc>
+          <w:tcPr>
+            <w:tcW w:type="dxa" w:w="2880"/>
+          </w:tcPr>
+          <w:p>
+            <w:pPr>
+              <w:spacing w:after="20"/>
+            </w:pPr>
+            <w:r>
+              <w:rPr>
+                <w:rFonts w:ascii="微软雅黑" w:hAnsi="微软雅黑" w:eastAsia="微软雅黑"/>
+                <w:b w:val="0"/>
+                <w:sz w:val="19"/>
+              </w:rPr>
+              <w:t>新模块专项</w:t>
+            </w:r>
+          </w:p>
+        </w:tc>
+        <w:tc>
+          <w:tcPr>
+            <w:tcW w:type="dxa" w:w="2880"/>
+          </w:tcPr>
+          <w:p>
+            <w:pPr>
+              <w:spacing w:after="20"/>
+            </w:pPr>
+            <w:r>
+              <w:rPr>
+                <w:rFonts w:ascii="微软雅黑" w:hAnsi="微软雅黑" w:eastAsia="微软雅黑"/>
+                <w:b w:val="0"/>
+                <w:sz w:val="19"/>
+              </w:rPr>
+              <w:t>binx/hexq/filemerge/stego/rev</w:t>
+            </w:r>
+          </w:p>
+        </w:tc>
+        <w:tc>
+          <w:tcPr>
+            <w:tcW w:type="dxa" w:w="2880"/>
+          </w:tcPr>
+          <w:p>
+            <w:pPr>
+              <w:spacing w:after="20"/>
+            </w:pPr>
+            <w:r>
+              <w:rPr>
+                <w:rFonts w:ascii="微软雅黑" w:hAnsi="微软雅黑" w:eastAsia="微软雅黑"/>
+                <w:b w:val="0"/>
+                <w:sz w:val="19"/>
+              </w:rPr>
+              <w:t>117</w:t>
+            </w:r>
+          </w:p>
+        </w:tc>
+      </w:tr>
+      <w:tr>
+        <w:tc>
+          <w:tcPr>
+            <w:tcW w:type="dxa" w:w="2880"/>
+          </w:tcPr>
+          <w:p>
+            <w:pPr>
+              <w:spacing w:after="20"/>
+            </w:pPr>
+            <w:r>
+              <w:rPr>
+                <w:rFonts w:ascii="微软雅黑" w:hAnsi="微软雅黑" w:eastAsia="微软雅黑"/>
+                <w:b w:val="0"/>
+                <w:sz w:val="19"/>
+              </w:rPr>
+              <w:t>古典端到端</w:t>
+            </w:r>
+          </w:p>
+        </w:tc>
+        <w:tc>
+          <w:tcPr>
+            <w:tcW w:type="dxa" w:w="2880"/>
+          </w:tcPr>
+          <w:p>
+            <w:pPr>
+              <w:spacing w:after="20"/>
+            </w:pPr>
+            <w:r>
+              <w:rPr>
+                <w:rFonts w:ascii="微软雅黑" w:hAnsi="微软雅黑" w:eastAsia="微软雅黑"/>
+                <w:b w:val="0"/>
+                <w:sz w:val="19"/>
+              </w:rPr>
+              <w:t>古典密码识别链路</w:t>
+            </w:r>
+          </w:p>
+        </w:tc>
+        <w:tc>
+          <w:tcPr>
+            <w:tcW w:type="dxa" w:w="2880"/>
+          </w:tcPr>
+          <w:p>
+            <w:pPr>
+              <w:spacing w:after="20"/>
+            </w:pPr>
+            <w:r>
+              <w:rPr>
+                <w:rFonts w:ascii="微软雅黑" w:hAnsi="微软雅黑" w:eastAsia="微软雅黑"/>
+                <w:b w:val="0"/>
+                <w:sz w:val="19"/>
+              </w:rPr>
+              <w:t>10</w:t>
+            </w:r>
+          </w:p>
+        </w:tc>
+      </w:tr>
     </w:tbl>
     <w:p/>
     <w:p/>
@@ -10405,7 +10590,23 @@
                 <w:b w:val="0"/>
                 <w:sz w:val="19"/>
               </w:rPr>
-              <w:t>、Atbash、ROT13、ROT47、ROT5、栅栏（2–12 栏）、培根、A1Z26（</w:t>
+              <w:t>、Atbash、ROT13、ROT47、ROT5、栅栏（2–12 栏，</w:t>
+            </w:r>
+            <w:r>
+              <w:rPr>
+                <w:rFonts w:ascii="微软雅黑" w:hAnsi="微软雅黑" w:eastAsia="微软雅黑"/>
+                <w:b/>
+                <w:sz w:val="19"/>
+              </w:rPr>
+              <w:t>交错/解密两个方向</w:t>
+            </w:r>
+            <w:r>
+              <w:rPr>
+                <w:rFonts w:ascii="微软雅黑" w:hAnsi="微软雅黑" w:eastAsia="微软雅黑"/>
+                <w:b w:val="0"/>
+                <w:sz w:val="19"/>
+              </w:rPr>
+              <w:t>）、培根、A1Z26（</w:t>
             </w:r>
             <w:r>
               <w:rPr>
@@ -10455,7 +10656,23 @@
                 <w:b w:val="0"/>
                 <w:sz w:val="19"/>
               </w:rPr>
-              <w:t>）、键盘左右移位、反转、</w:t>
+              <w:t>）、</w:t>
+            </w:r>
+            <w:r>
+              <w:rPr>
+                <w:rFonts w:ascii="微软雅黑" w:hAnsi="微软雅黑" w:eastAsia="微软雅黑"/>
+                <w:b/>
+                <w:sz w:val="19"/>
+              </w:rPr>
+              <w:t>QWE 键盘替换</w:t>
+            </w:r>
+            <w:r>
+              <w:rPr>
+                <w:rFonts w:ascii="微软雅黑" w:hAnsi="微软雅黑" w:eastAsia="微软雅黑"/>
+                <w:b w:val="0"/>
+                <w:sz w:val="19"/>
+              </w:rPr>
+              <w:t>（「QWE 到底等不等于 ABC」）、键盘左右移位、反转、</w:t>
             </w:r>
             <w:r>
               <w:rPr>
@@ -11437,7 +11654,79 @@
                 <w:b w:val="0"/>
                 <w:sz w:val="19"/>
               </w:rPr>
-              <w:t>试 2~12 栏栅栏</w:t>
+              <w:t>试 2~12 栏栅栏（交错/解密两个方向）</w:t>
+            </w:r>
+          </w:p>
+        </w:tc>
+      </w:tr>
+      <w:tr>
+        <w:tc>
+          <w:tcPr>
+            <w:tcW w:type="dxa" w:w="2880"/>
+          </w:tcPr>
+          <w:p>
+            <w:pPr>
+              <w:spacing w:after="20"/>
+            </w:pPr>
+            <w:r>
+              <w:rPr>
+                <w:rFonts w:ascii="微软雅黑" w:hAnsi="微软雅黑" w:eastAsia="微软雅黑"/>
+                <w:b w:val="0"/>
+                <w:sz w:val="19"/>
+              </w:rPr>
+              <w:t>摩斯解出一串乱字母</w:t>
+            </w:r>
+          </w:p>
+        </w:tc>
+        <w:tc>
+          <w:tcPr>
+            <w:tcW w:type="dxa" w:w="2880"/>
+          </w:tcPr>
+          <w:p>
+            <w:pPr>
+              <w:spacing w:after="20"/>
+            </w:pPr>
+            <w:r>
+              <w:rPr>
+                <w:rFonts w:ascii="微软雅黑" w:hAnsi="微软雅黑" w:eastAsia="微软雅黑"/>
+                <w:b w:val="0"/>
+                <w:sz w:val="19"/>
+              </w:rPr>
+              <w:t>纯字母</w:t>
+            </w:r>
+          </w:p>
+        </w:tc>
+        <w:tc>
+          <w:tcPr>
+            <w:tcW w:type="dxa" w:w="2880"/>
+          </w:tcPr>
+          <w:p>
+            <w:pPr>
+              <w:spacing w:after="20"/>
+            </w:pPr>
+            <w:r>
+              <w:rPr>
+                <w:rFonts w:ascii="微软雅黑" w:hAnsi="微软雅黑" w:eastAsia="微软雅黑"/>
+                <w:b w:val="0"/>
+                <w:sz w:val="19"/>
+              </w:rPr>
+              <w:t xml:space="preserve">自动试 </w:t>
+            </w:r>
+            <w:r>
+              <w:rPr>
+                <w:rFonts w:ascii="微软雅黑" w:hAnsi="微软雅黑" w:eastAsia="微软雅黑"/>
+                <w:b/>
+                <w:sz w:val="19"/>
+              </w:rPr>
+              <w:t>QWE 键盘替换 + 反转 + 栅栏</w:t>
+            </w:r>
+            <w:r>
+              <w:rPr>
+                <w:rFonts w:ascii="微软雅黑" w:hAnsi="微软雅黑" w:eastAsia="微软雅黑"/>
+                <w:b w:val="0"/>
+                <w:sz w:val="19"/>
+              </w:rPr>
+              <w:t xml:space="preserve"> 的组合</w:t>
             </w:r>
           </w:p>
         </w:tc>

</xml_diff>

<commit_message>
chore: 同步 FlagRush.spec, build_package.py, core/misc.py, core/preflight_test.py, core/rsa.py, core/selftest_web.py, core/webserver.py, ctf_oneclick.pyw, 使用说明.md, 使用说明.docx, 详细测试报告_20261026.md, 详细测试报告_20261026.docx, 赛前自检.bat
</commit_message>
<xml_diff>
--- a/使用说明.docx
+++ b/使用说明.docx
@@ -437,10 +437,10 @@
             <w:r>
               <w:rPr>
                 <w:rFonts w:ascii="微软雅黑" w:hAnsi="微软雅黑" w:eastAsia="微软雅黑"/>
-                <w:b w:val="0"/>
-                <w:sz w:val="19"/>
-              </w:rPr>
-              <w:t>自检</w:t>
+                <w:b/>
+                <w:sz w:val="19"/>
+              </w:rPr>
+              <w:t>赛前自检</w:t>
             </w:r>
           </w:p>
         </w:tc>
@@ -467,7 +467,7 @@
                 <w:color w:val="C7254E"/>
                 <w:sz w:val="17"/>
               </w:rPr>
-              <w:t>自检.bat</w:t>
+              <w:t>赛前自检.bat</w:t>
             </w:r>
           </w:p>
         </w:tc>
@@ -482,10 +482,83 @@
             <w:r>
               <w:rPr>
                 <w:rFonts w:ascii="微软雅黑" w:hAnsi="微软雅黑" w:eastAsia="微软雅黑"/>
+                <w:b/>
+                <w:sz w:val="19"/>
+              </w:rPr>
+              <w:t>比赛前在比赛机上跑一遍</w:t>
+            </w:r>
+            <w:r>
+              <w:rPr>
+                <w:rFonts w:ascii="微软雅黑" w:hAnsi="微软雅黑" w:eastAsia="微软雅黑"/>
                 <w:b w:val="0"/>
                 <w:sz w:val="19"/>
               </w:rPr>
-              <w:t>验证这套工具在这台机器上能不能跑</w:t>
+              <w:t>，7 秒告诉你环境/工具/端口/常见题型有没有问题</w:t>
+            </w:r>
+          </w:p>
+        </w:tc>
+      </w:tr>
+      <w:tr>
+        <w:tc>
+          <w:tcPr>
+            <w:tcW w:type="dxa" w:w="2880"/>
+          </w:tcPr>
+          <w:p>
+            <w:pPr>
+              <w:spacing w:after="20"/>
+            </w:pPr>
+            <w:r>
+              <w:rPr>
+                <w:rFonts w:ascii="微软雅黑" w:hAnsi="微软雅黑" w:eastAsia="微软雅黑"/>
+                <w:b w:val="0"/>
+                <w:sz w:val="19"/>
+              </w:rPr>
+              <w:t>自检</w:t>
+            </w:r>
+          </w:p>
+        </w:tc>
+        <w:tc>
+          <w:tcPr>
+            <w:tcW w:type="dxa" w:w="2880"/>
+          </w:tcPr>
+          <w:p>
+            <w:pPr>
+              <w:spacing w:after="20"/>
+            </w:pPr>
+            <w:r>
+              <w:rPr>
+                <w:rFonts w:ascii="微软雅黑" w:hAnsi="微软雅黑" w:eastAsia="微软雅黑"/>
+                <w:b w:val="0"/>
+                <w:sz w:val="19"/>
+              </w:rPr>
+              <w:t xml:space="preserve">双击 </w:t>
+            </w:r>
+            <w:r>
+              <w:rPr>
+                <w:rFonts w:ascii="Consolas" w:hAnsi="Consolas" w:eastAsia="Consolas"/>
+                <w:b/>
+                <w:color w:val="C7254E"/>
+                <w:sz w:val="17"/>
+              </w:rPr>
+              <w:t>自检.bat</w:t>
+            </w:r>
+          </w:p>
+        </w:tc>
+        <w:tc>
+          <w:tcPr>
+            <w:tcW w:type="dxa" w:w="2880"/>
+          </w:tcPr>
+          <w:p>
+            <w:pPr>
+              <w:spacing w:after="20"/>
+            </w:pPr>
+            <w:r>
+              <w:rPr>
+                <w:rFonts w:ascii="微软雅黑" w:hAnsi="微软雅黑" w:eastAsia="微软雅黑"/>
+                <w:b w:val="0"/>
+                <w:sz w:val="19"/>
+              </w:rPr>
+              <w:t>开发用的全量回归（60+ 项，两分钟）</w:t>
             </w:r>
           </w:p>
         </w:tc>

</xml_diff>

<commit_message>
chore: 同步 core/runner.py, core/rev.py, core/ocrx.py, core/robust_test.py, ctf_oneclick.pyw, build_package.py, tools/run_all_tests.py, 一键重启.bat, 启动诊断.bat, 使用说明.md, 使用说明.docx, 详细测试报告_20261026.md, 详细测试报告_20261026.docx, README.md
</commit_message>
<xml_diff>
--- a/使用说明.docx
+++ b/使用说明.docx
@@ -1286,6 +1286,419 @@
       <w:r>
         <w:rPr>
           <w:rFonts w:ascii="微软雅黑" w:hAnsi="微软雅黑" w:eastAsia="微软雅黑"/>
+          <w:b/>
+          <w:sz w:val="21"/>
+        </w:rPr>
+        <w:t>★ 界面打不开 / 卡住了，按这个顺序来：</w:t>
+      </w:r>
+    </w:p>
+    <w:p/>
+    <w:tbl>
+      <w:tblPr>
+        <w:tblStyle w:val="TableGrid"/>
+        <w:tblW w:type="auto" w:w="0"/>
+        <w:jc w:val="center"/>
+        <w:tblLook w:firstColumn="1" w:firstRow="1" w:lastColumn="0" w:lastRow="0" w:noHBand="0" w:noVBand="1" w:val="04A0"/>
+      </w:tblPr>
+      <w:tblGrid>
+        <w:gridCol w:w="4320"/>
+        <w:gridCol w:w="4320"/>
+      </w:tblGrid>
+      <w:tr>
+        <w:tc>
+          <w:tcPr>
+            <w:tcW w:type="dxa" w:w="4320"/>
+          </w:tcPr>
+          <w:p>
+            <w:pPr>
+              <w:spacing w:after="20"/>
+            </w:pPr>
+            <w:r>
+              <w:rPr>
+                <w:rFonts w:ascii="微软雅黑" w:hAnsi="微软雅黑" w:eastAsia="微软雅黑"/>
+                <w:b/>
+                <w:sz w:val="19"/>
+              </w:rPr>
+              <w:t>现象</w:t>
+            </w:r>
+          </w:p>
+        </w:tc>
+        <w:tc>
+          <w:tcPr>
+            <w:tcW w:type="dxa" w:w="4320"/>
+          </w:tcPr>
+          <w:p>
+            <w:pPr>
+              <w:spacing w:after="20"/>
+            </w:pPr>
+            <w:r>
+              <w:rPr>
+                <w:rFonts w:ascii="微软雅黑" w:hAnsi="微软雅黑" w:eastAsia="微软雅黑"/>
+                <w:b/>
+                <w:sz w:val="19"/>
+              </w:rPr>
+              <w:t>做法</w:t>
+            </w:r>
+          </w:p>
+        </w:tc>
+      </w:tr>
+      <w:tr>
+        <w:tc>
+          <w:tcPr>
+            <w:tcW w:type="dxa" w:w="4320"/>
+          </w:tcPr>
+          <w:p>
+            <w:pPr>
+              <w:spacing w:after="20"/>
+            </w:pPr>
+            <w:r>
+              <w:rPr>
+                <w:rFonts w:ascii="微软雅黑" w:hAnsi="微软雅黑" w:eastAsia="微软雅黑"/>
+                <w:b w:val="0"/>
+                <w:sz w:val="19"/>
+              </w:rPr>
+              <w:t xml:space="preserve">双击 exe 弹一个标题是 </w:t>
+            </w:r>
+            <w:r>
+              <w:rPr>
+                <w:rFonts w:ascii="Consolas" w:hAnsi="Consolas" w:eastAsia="Consolas"/>
+                <w:b w:val="0"/>
+                <w:color w:val="C7254E"/>
+                <w:sz w:val="17"/>
+              </w:rPr>
+              <w:t>Error</w:t>
+            </w:r>
+            <w:r>
+              <w:rPr>
+                <w:rFonts w:ascii="微软雅黑" w:hAnsi="微软雅黑" w:eastAsia="微软雅黑"/>
+                <w:b w:val="0"/>
+                <w:sz w:val="19"/>
+              </w:rPr>
+              <w:t xml:space="preserve"> 的英文框</w:t>
+            </w:r>
+          </w:p>
+        </w:tc>
+        <w:tc>
+          <w:tcPr>
+            <w:tcW w:type="dxa" w:w="4320"/>
+          </w:tcPr>
+          <w:p>
+            <w:pPr>
+              <w:spacing w:after="20"/>
+            </w:pPr>
+            <w:r>
+              <w:rPr>
+                <w:rFonts w:ascii="微软雅黑" w:hAnsi="微软雅黑" w:eastAsia="微软雅黑"/>
+                <w:b/>
+                <w:sz w:val="19"/>
+              </w:rPr>
+              <w:t xml:space="preserve">只拷了 exe，没带 </w:t>
+            </w:r>
+            <w:r>
+              <w:rPr>
+                <w:rFonts w:ascii="Consolas" w:hAnsi="Consolas" w:eastAsia="Consolas"/>
+                <w:b/>
+                <w:color w:val="C7254E"/>
+                <w:sz w:val="17"/>
+              </w:rPr>
+              <w:t>_internal</w:t>
+            </w:r>
+            <w:r>
+              <w:rPr>
+                <w:rFonts w:ascii="微软雅黑" w:hAnsi="微软雅黑" w:eastAsia="微软雅黑"/>
+                <w:b w:val="0"/>
+                <w:sz w:val="19"/>
+              </w:rPr>
+              <w:t>。必须整个文件夹一起拷</w:t>
+            </w:r>
+          </w:p>
+        </w:tc>
+      </w:tr>
+      <w:tr>
+        <w:tc>
+          <w:tcPr>
+            <w:tcW w:type="dxa" w:w="4320"/>
+          </w:tcPr>
+          <w:p>
+            <w:pPr>
+              <w:spacing w:after="20"/>
+            </w:pPr>
+            <w:r>
+              <w:rPr>
+                <w:rFonts w:ascii="微软雅黑" w:hAnsi="微软雅黑" w:eastAsia="微软雅黑"/>
+                <w:b w:val="0"/>
+                <w:sz w:val="19"/>
+              </w:rPr>
+              <w:t>双击没反应，进程列表里也没有</w:t>
+            </w:r>
+          </w:p>
+        </w:tc>
+        <w:tc>
+          <w:tcPr>
+            <w:tcW w:type="dxa" w:w="4320"/>
+          </w:tcPr>
+          <w:p>
+            <w:pPr>
+              <w:spacing w:after="20"/>
+            </w:pPr>
+            <w:r>
+              <w:rPr>
+                <w:rFonts w:ascii="微软雅黑" w:hAnsi="微软雅黑" w:eastAsia="微软雅黑"/>
+                <w:b w:val="0"/>
+                <w:sz w:val="19"/>
+              </w:rPr>
+              <w:t xml:space="preserve">杀毒软件拦了。把整个文件夹加入白名单，或双击 </w:t>
+            </w:r>
+            <w:r>
+              <w:rPr>
+                <w:rFonts w:ascii="Consolas" w:hAnsi="Consolas" w:eastAsia="Consolas"/>
+                <w:b/>
+                <w:color w:val="C7254E"/>
+                <w:sz w:val="17"/>
+              </w:rPr>
+              <w:t>启动诊断.bat</w:t>
+            </w:r>
+            <w:r>
+              <w:rPr>
+                <w:rFonts w:ascii="微软雅黑" w:hAnsi="微软雅黑" w:eastAsia="微软雅黑"/>
+                <w:b w:val="0"/>
+                <w:sz w:val="19"/>
+              </w:rPr>
+              <w:t xml:space="preserve"> 看是哪一步失败</w:t>
+            </w:r>
+          </w:p>
+        </w:tc>
+      </w:tr>
+      <w:tr>
+        <w:tc>
+          <w:tcPr>
+            <w:tcW w:type="dxa" w:w="4320"/>
+          </w:tcPr>
+          <w:p>
+            <w:pPr>
+              <w:spacing w:after="20"/>
+            </w:pPr>
+            <w:r>
+              <w:rPr>
+                <w:rFonts w:ascii="微软雅黑" w:hAnsi="微软雅黑" w:eastAsia="微软雅黑"/>
+                <w:b w:val="0"/>
+                <w:sz w:val="19"/>
+              </w:rPr>
+              <w:t>窗口打不开，但任务管理器里有 FlagRush.exe</w:t>
+            </w:r>
+          </w:p>
+        </w:tc>
+        <w:tc>
+          <w:tcPr>
+            <w:tcW w:type="dxa" w:w="4320"/>
+          </w:tcPr>
+          <w:p>
+            <w:pPr>
+              <w:spacing w:after="20"/>
+            </w:pPr>
+            <w:r>
+              <w:rPr>
+                <w:rFonts w:ascii="微软雅黑" w:hAnsi="微软雅黑" w:eastAsia="微软雅黑"/>
+                <w:b w:val="0"/>
+                <w:sz w:val="19"/>
+              </w:rPr>
+              <w:t xml:space="preserve">上次卡死的残留进程。双击 </w:t>
+            </w:r>
+            <w:r>
+              <w:rPr>
+                <w:rFonts w:ascii="Consolas" w:hAnsi="Consolas" w:eastAsia="Consolas"/>
+                <w:b/>
+                <w:color w:val="C7254E"/>
+                <w:sz w:val="17"/>
+              </w:rPr>
+              <w:t>一键重启.bat</w:t>
+            </w:r>
+            <w:r>
+              <w:rPr>
+                <w:rFonts w:ascii="微软雅黑" w:hAnsi="微软雅黑" w:eastAsia="微软雅黑"/>
+                <w:b w:val="0"/>
+                <w:sz w:val="19"/>
+              </w:rPr>
+              <w:t>（自动结束残留 + 检查文件 + 重启）</w:t>
+            </w:r>
+          </w:p>
+        </w:tc>
+      </w:tr>
+      <w:tr>
+        <w:tc>
+          <w:tcPr>
+            <w:tcW w:type="dxa" w:w="4320"/>
+          </w:tcPr>
+          <w:p>
+            <w:pPr>
+              <w:spacing w:after="20"/>
+            </w:pPr>
+            <w:r>
+              <w:rPr>
+                <w:rFonts w:ascii="微软雅黑" w:hAnsi="微软雅黑" w:eastAsia="微软雅黑"/>
+                <w:b w:val="0"/>
+                <w:sz w:val="19"/>
+              </w:rPr>
+              <w:t>分析卡在「正在分析…」不动</w:t>
+            </w:r>
+          </w:p>
+        </w:tc>
+        <w:tc>
+          <w:tcPr>
+            <w:tcW w:type="dxa" w:w="4320"/>
+          </w:tcPr>
+          <w:p>
+            <w:pPr>
+              <w:spacing w:after="20"/>
+            </w:pPr>
+            <w:r>
+              <w:rPr>
+                <w:rFonts w:ascii="微软雅黑" w:hAnsi="微软雅黑" w:eastAsia="微软雅黑"/>
+                <w:b w:val="0"/>
+                <w:sz w:val="19"/>
+              </w:rPr>
+              <w:t>看状态栏的</w:t>
+            </w:r>
+            <w:r>
+              <w:rPr>
+                <w:rFonts w:ascii="微软雅黑" w:hAnsi="微软雅黑" w:eastAsia="微软雅黑"/>
+                <w:b/>
+                <w:sz w:val="19"/>
+              </w:rPr>
+              <w:t>已用秒数</w:t>
+            </w:r>
+            <w:r>
+              <w:rPr>
+                <w:rFonts w:ascii="微软雅黑" w:hAnsi="微软雅黑" w:eastAsia="微软雅黑"/>
+                <w:b w:val="0"/>
+                <w:sz w:val="19"/>
+              </w:rPr>
+              <w:t xml:space="preserve">。超过 20 秒可以直接点 </w:t>
+            </w:r>
+            <w:r>
+              <w:rPr>
+                <w:rFonts w:ascii="微软雅黑" w:hAnsi="微软雅黑" w:eastAsia="微软雅黑"/>
+                <w:b/>
+                <w:sz w:val="19"/>
+              </w:rPr>
+              <w:t>「■ 停止」</w:t>
+            </w:r>
+            <w:r>
+              <w:rPr>
+                <w:rFonts w:ascii="微软雅黑" w:hAnsi="微软雅黑" w:eastAsia="微软雅黑"/>
+                <w:b w:val="0"/>
+                <w:sz w:val="19"/>
+              </w:rPr>
+              <w:t>，换对应的分类型面板再试（比如只开③逆向，不要用⓪一键）</w:t>
+            </w:r>
+          </w:p>
+        </w:tc>
+      </w:tr>
+      <w:tr>
+        <w:tc>
+          <w:tcPr>
+            <w:tcW w:type="dxa" w:w="4320"/>
+          </w:tcPr>
+          <w:p>
+            <w:pPr>
+              <w:spacing w:after="20"/>
+            </w:pPr>
+            <w:r>
+              <w:rPr>
+                <w:rFonts w:ascii="微软雅黑" w:hAnsi="微软雅黑" w:eastAsia="微软雅黑"/>
+                <w:b w:val="0"/>
+                <w:sz w:val="19"/>
+              </w:rPr>
+              <w:t>不知道哪里坏了</w:t>
+            </w:r>
+          </w:p>
+        </w:tc>
+        <w:tc>
+          <w:tcPr>
+            <w:tcW w:type="dxa" w:w="4320"/>
+          </w:tcPr>
+          <w:p>
+            <w:pPr>
+              <w:spacing w:after="20"/>
+            </w:pPr>
+            <w:r>
+              <w:rPr>
+                <w:rFonts w:ascii="微软雅黑" w:hAnsi="微软雅黑" w:eastAsia="微软雅黑"/>
+                <w:b w:val="0"/>
+                <w:sz w:val="19"/>
+              </w:rPr>
+              <w:t xml:space="preserve">双击 </w:t>
+            </w:r>
+            <w:r>
+              <w:rPr>
+                <w:rFonts w:ascii="Consolas" w:hAnsi="Consolas" w:eastAsia="Consolas"/>
+                <w:b/>
+                <w:color w:val="C7254E"/>
+                <w:sz w:val="17"/>
+              </w:rPr>
+              <w:t>启动诊断.bat</w:t>
+            </w:r>
+            <w:r>
+              <w:rPr>
+                <w:rFonts w:ascii="微软雅黑" w:hAnsi="微软雅黑" w:eastAsia="微软雅黑"/>
+                <w:b w:val="0"/>
+                <w:sz w:val="19"/>
+              </w:rPr>
+              <w:t>，它会把「文件齐不齐 / 有没有残留进程 / 上次的启动错误 / 能不能真的起来」逐项打出来</w:t>
+            </w:r>
+          </w:p>
+        </w:tc>
+      </w:tr>
+    </w:tbl>
+    <w:p/>
+    <w:p/>
+    <w:p>
+      <w:pPr>
+        <w:spacing w:after="60"/>
+      </w:pPr>
+      <w:r>
+        <w:rPr>
+          <w:rFonts w:ascii="Consolas" w:hAnsi="Consolas" w:eastAsia="Consolas"/>
+          <w:b w:val="0"/>
+          <w:color w:val="C7254E"/>
+          <w:sz w:val="19"/>
+        </w:rPr>
+        <w:t>一键重启.bat</w:t>
+      </w:r>
+      <w:r>
+        <w:rPr>
+          <w:rFonts w:ascii="微软雅黑" w:hAnsi="微软雅黑" w:eastAsia="微软雅黑"/>
+          <w:b w:val="0"/>
+          <w:sz w:val="21"/>
+        </w:rPr>
+        <w:t xml:space="preserve"> 和 </w:t>
+      </w:r>
+      <w:r>
+        <w:rPr>
+          <w:rFonts w:ascii="Consolas" w:hAnsi="Consolas" w:eastAsia="Consolas"/>
+          <w:b w:val="0"/>
+          <w:color w:val="C7254E"/>
+          <w:sz w:val="19"/>
+        </w:rPr>
+        <w:t>启动诊断.bat</w:t>
+      </w:r>
+      <w:r>
+        <w:rPr>
+          <w:rFonts w:ascii="微软雅黑" w:hAnsi="微软雅黑" w:eastAsia="微软雅黑"/>
+          <w:b w:val="0"/>
+          <w:sz w:val="21"/>
+        </w:rPr>
+        <w:t xml:space="preserve"> 在 exe 旁边，输出全是中文，看一眼就知道问题在哪。</w:t>
+      </w:r>
+    </w:p>
+    <w:p/>
+    <w:p>
+      <w:pPr>
+        <w:spacing w:after="60"/>
+      </w:pPr>
+      <w:r>
+        <w:rPr>
+          <w:rFonts w:ascii="微软雅黑" w:hAnsi="微软雅黑" w:eastAsia="微软雅黑"/>
           <w:b w:val="0"/>
           <w:sz w:val="21"/>
         </w:rPr>
@@ -5587,6 +6000,683 @@
       </w:r>
     </w:p>
     <w:p/>
+    <w:p/>
+    <w:p>
+      <w:pPr>
+        <w:pStyle w:val="Heading2"/>
+      </w:pPr>
+      <w:r>
+        <w:rPr>
+          <w:rFonts w:ascii="微软雅黑" w:hAnsi="微软雅黑" w:eastAsia="微软雅黑"/>
+          <w:b w:val="0"/>
+          <w:color w:val="1F3A5F"/>
+          <w:sz w:val="30"/>
+        </w:rPr>
+        <w:t>五之二、分析卡住 / 很慢怎么办</w:t>
+      </w:r>
+    </w:p>
+    <w:p/>
+    <w:p>
+      <w:pPr>
+        <w:spacing w:after="60"/>
+      </w:pPr>
+      <w:r>
+        <w:rPr>
+          <w:rFonts w:ascii="微软雅黑" w:hAnsi="微软雅黑" w:eastAsia="微软雅黑"/>
+          <w:b w:val="0"/>
+          <w:sz w:val="21"/>
+        </w:rPr>
+        <w:t xml:space="preserve">界面上分析时按钮会变成 </w:t>
+      </w:r>
+      <w:r>
+        <w:rPr>
+          <w:rFonts w:ascii="微软雅黑" w:hAnsi="微软雅黑" w:eastAsia="微软雅黑"/>
+          <w:b/>
+          <w:sz w:val="21"/>
+        </w:rPr>
+        <w:t>「■ 停止」</w:t>
+      </w:r>
+      <w:r>
+        <w:rPr>
+          <w:rFonts w:ascii="微软雅黑" w:hAnsi="微软雅黑" w:eastAsia="微软雅黑"/>
+          <w:b w:val="0"/>
+          <w:sz w:val="21"/>
+        </w:rPr>
+        <w:t xml:space="preserve">，状态栏会一直显示 </w:t>
+      </w:r>
+      <w:r>
+        <w:rPr>
+          <w:rFonts w:ascii="微软雅黑" w:hAnsi="微软雅黑" w:eastAsia="微软雅黑"/>
+          <w:b/>
+          <w:sz w:val="21"/>
+        </w:rPr>
+        <w:t>「正在分析… 已 N 秒」</w:t>
+      </w:r>
+      <w:r>
+        <w:rPr>
+          <w:rFonts w:ascii="微软雅黑" w:hAnsi="微软雅黑" w:eastAsia="微软雅黑"/>
+          <w:b w:val="0"/>
+          <w:sz w:val="21"/>
+        </w:rPr>
+        <w:t>。</w:t>
+      </w:r>
+    </w:p>
+    <w:p/>
+    <w:p>
+      <w:pPr>
+        <w:pStyle w:val="ListBullet"/>
+        <w:spacing w:after="20"/>
+      </w:pPr>
+      <w:r>
+        <w:rPr>
+          <w:rFonts w:ascii="微软雅黑" w:hAnsi="微软雅黑" w:eastAsia="微软雅黑"/>
+          <w:b/>
+          <w:sz w:val="21"/>
+        </w:rPr>
+        <w:t>20 秒内</w:t>
+      </w:r>
+      <w:r>
+        <w:rPr>
+          <w:rFonts w:ascii="微软雅黑" w:hAnsi="微软雅黑" w:eastAsia="微软雅黑"/>
+          <w:b w:val="0"/>
+          <w:sz w:val="21"/>
+        </w:rPr>
+        <w:t>：正常。常见题型耗时见下表，大图/大 exe 会慢一些</w:t>
+      </w:r>
+    </w:p>
+    <w:p>
+      <w:pPr>
+        <w:pStyle w:val="ListBullet"/>
+        <w:spacing w:after="20"/>
+      </w:pPr>
+      <w:r>
+        <w:rPr>
+          <w:rFonts w:ascii="微软雅黑" w:hAnsi="微软雅黑" w:eastAsia="微软雅黑"/>
+          <w:b/>
+          <w:sz w:val="21"/>
+        </w:rPr>
+        <w:t>超过 20 秒</w:t>
+      </w:r>
+      <w:r>
+        <w:rPr>
+          <w:rFonts w:ascii="微软雅黑" w:hAnsi="微软雅黑" w:eastAsia="微软雅黑"/>
+          <w:b w:val="0"/>
+          <w:sz w:val="21"/>
+        </w:rPr>
+        <w:t xml:space="preserve">：状态栏会提示「可以点停止」。点 </w:t>
+      </w:r>
+      <w:r>
+        <w:rPr>
+          <w:rFonts w:ascii="微软雅黑" w:hAnsi="微软雅黑" w:eastAsia="微软雅黑"/>
+          <w:b/>
+          <w:sz w:val="21"/>
+        </w:rPr>
+        <w:t>「■ 停止」</w:t>
+      </w:r>
+      <w:r>
+        <w:rPr>
+          <w:rFonts w:ascii="微软雅黑" w:hAnsi="微软雅黑" w:eastAsia="微软雅黑"/>
+          <w:b w:val="0"/>
+          <w:sz w:val="21"/>
+        </w:rPr>
+        <w:t xml:space="preserve"> 立刻恢复界面，</w:t>
+      </w:r>
+    </w:p>
+    <w:p>
+      <w:pPr>
+        <w:spacing w:after="60"/>
+      </w:pPr>
+      <w:r>
+        <w:rPr>
+          <w:rFonts w:ascii="微软雅黑" w:hAnsi="微软雅黑" w:eastAsia="微软雅黑"/>
+          <w:b w:val="0"/>
+          <w:sz w:val="21"/>
+        </w:rPr>
+        <w:t xml:space="preserve">  后台线程会在跑完后自己结束（不会再往界面上刷东西）</w:t>
+      </w:r>
+    </w:p>
+    <w:p>
+      <w:pPr>
+        <w:pStyle w:val="ListBullet"/>
+        <w:spacing w:after="20"/>
+      </w:pPr>
+      <w:r>
+        <w:rPr>
+          <w:rFonts w:ascii="微软雅黑" w:hAnsi="微软雅黑" w:eastAsia="微软雅黑"/>
+          <w:b/>
+          <w:sz w:val="21"/>
+        </w:rPr>
+        <w:t>停止后</w:t>
+      </w:r>
+      <w:r>
+        <w:rPr>
+          <w:rFonts w:ascii="微软雅黑" w:hAnsi="微软雅黑" w:eastAsia="微软雅黑"/>
+          <w:b w:val="0"/>
+          <w:sz w:val="21"/>
+        </w:rPr>
+        <w:t xml:space="preserve">：换 </w:t>
+      </w:r>
+      <w:r>
+        <w:rPr>
+          <w:rFonts w:ascii="微软雅黑" w:hAnsi="微软雅黑" w:eastAsia="微软雅黑"/>
+          <w:b/>
+          <w:sz w:val="21"/>
+        </w:rPr>
+        <w:t>分类型面板</w:t>
+      </w:r>
+      <w:r>
+        <w:rPr>
+          <w:rFonts w:ascii="微软雅黑" w:hAnsi="微软雅黑" w:eastAsia="微软雅黑"/>
+          <w:b w:val="0"/>
+          <w:sz w:val="21"/>
+        </w:rPr>
+        <w:t xml:space="preserve"> 再试，比「⓪ 一键」快很多。比如</w:t>
+      </w:r>
+    </w:p>
+    <w:p>
+      <w:pPr>
+        <w:pStyle w:val="ListBullet2"/>
+        <w:spacing w:after="20"/>
+      </w:pPr>
+      <w:r>
+        <w:rPr>
+          <w:rFonts w:ascii="微软雅黑" w:hAnsi="微软雅黑" w:eastAsia="微软雅黑"/>
+          <w:b w:val="0"/>
+          <w:sz w:val="21"/>
+        </w:rPr>
+        <w:t xml:space="preserve">只怀疑是隐写 → 只开 </w:t>
+      </w:r>
+      <w:r>
+        <w:rPr>
+          <w:rFonts w:ascii="微软雅黑" w:hAnsi="微软雅黑" w:eastAsia="微软雅黑"/>
+          <w:b/>
+          <w:sz w:val="21"/>
+        </w:rPr>
+        <w:t>① 综合</w:t>
+      </w:r>
+    </w:p>
+    <w:p>
+      <w:pPr>
+        <w:pStyle w:val="ListBullet2"/>
+        <w:spacing w:after="20"/>
+      </w:pPr>
+      <w:r>
+        <w:rPr>
+          <w:rFonts w:ascii="微软雅黑" w:hAnsi="微软雅黑" w:eastAsia="微软雅黑"/>
+          <w:b w:val="0"/>
+          <w:sz w:val="21"/>
+        </w:rPr>
+        <w:t xml:space="preserve">只怀疑是加密 → 只开 </w:t>
+      </w:r>
+      <w:r>
+        <w:rPr>
+          <w:rFonts w:ascii="微软雅黑" w:hAnsi="微软雅黑" w:eastAsia="微软雅黑"/>
+          <w:b/>
+          <w:sz w:val="21"/>
+        </w:rPr>
+        <w:t>② 编码</w:t>
+      </w:r>
+    </w:p>
+    <w:p>
+      <w:pPr>
+        <w:pStyle w:val="ListBullet2"/>
+        <w:spacing w:after="20"/>
+      </w:pPr>
+      <w:r>
+        <w:rPr>
+          <w:rFonts w:ascii="微软雅黑" w:hAnsi="微软雅黑" w:eastAsia="微软雅黑"/>
+          <w:b w:val="0"/>
+          <w:sz w:val="21"/>
+        </w:rPr>
+        <w:t xml:space="preserve">只怀疑是 exe → 只开 </w:t>
+      </w:r>
+      <w:r>
+        <w:rPr>
+          <w:rFonts w:ascii="微软雅黑" w:hAnsi="微软雅黑" w:eastAsia="微软雅黑"/>
+          <w:b/>
+          <w:sz w:val="21"/>
+        </w:rPr>
+        <w:t>③ 逆向</w:t>
+      </w:r>
+    </w:p>
+    <w:p>
+      <w:pPr>
+        <w:pStyle w:val="ListBullet"/>
+        <w:spacing w:after="20"/>
+      </w:pPr>
+      <w:r>
+        <w:rPr>
+          <w:rFonts w:ascii="微软雅黑" w:hAnsi="微软雅黑" w:eastAsia="微软雅黑"/>
+          <w:b/>
+          <w:sz w:val="21"/>
+        </w:rPr>
+        <w:t>绝对兜底</w:t>
+      </w:r>
+      <w:r>
+        <w:rPr>
+          <w:rFonts w:ascii="微软雅黑" w:hAnsi="微软雅黑" w:eastAsia="微软雅黑"/>
+          <w:b w:val="0"/>
+          <w:sz w:val="21"/>
+        </w:rPr>
+        <w:t>：任何分析都有硬超时（文本 120 秒、文件 120 秒起、每 MB 加 2 秒、</w:t>
+      </w:r>
+    </w:p>
+    <w:p>
+      <w:pPr>
+        <w:spacing w:after="60"/>
+      </w:pPr>
+      <w:r>
+        <w:rPr>
+          <w:rFonts w:ascii="微软雅黑" w:hAnsi="微软雅黑" w:eastAsia="微软雅黑"/>
+          <w:b w:val="0"/>
+          <w:sz w:val="21"/>
+        </w:rPr>
+        <w:t xml:space="preserve">  最多 300 秒）。到点会直接返回「⚠ 分析超时」，界面不会永远转圈</w:t>
+      </w:r>
+    </w:p>
+    <w:p/>
+    <w:p>
+      <w:pPr>
+        <w:spacing w:after="60"/>
+      </w:pPr>
+      <w:r>
+        <w:rPr>
+          <w:rFonts w:ascii="微软雅黑" w:hAnsi="微软雅黑" w:eastAsia="微软雅黑"/>
+          <w:b/>
+          <w:sz w:val="21"/>
+        </w:rPr>
+        <w:t>常见题型耗时（本机实测，仅供参考）：</w:t>
+      </w:r>
+    </w:p>
+    <w:p/>
+    <w:tbl>
+      <w:tblPr>
+        <w:tblStyle w:val="TableGrid"/>
+        <w:tblW w:type="auto" w:w="0"/>
+        <w:jc w:val="center"/>
+        <w:tblLook w:firstColumn="1" w:firstRow="1" w:lastColumn="0" w:lastRow="0" w:noHBand="0" w:noVBand="1" w:val="04A0"/>
+      </w:tblPr>
+      <w:tblGrid>
+        <w:gridCol w:w="4320"/>
+        <w:gridCol w:w="4320"/>
+      </w:tblGrid>
+      <w:tr>
+        <w:tc>
+          <w:tcPr>
+            <w:tcW w:type="dxa" w:w="4320"/>
+          </w:tcPr>
+          <w:p>
+            <w:pPr>
+              <w:spacing w:after="20"/>
+            </w:pPr>
+            <w:r>
+              <w:rPr>
+                <w:rFonts w:ascii="微软雅黑" w:hAnsi="微软雅黑" w:eastAsia="微软雅黑"/>
+                <w:b/>
+                <w:sz w:val="19"/>
+              </w:rPr>
+              <w:t>题型</w:t>
+            </w:r>
+          </w:p>
+        </w:tc>
+        <w:tc>
+          <w:tcPr>
+            <w:tcW w:type="dxa" w:w="4320"/>
+          </w:tcPr>
+          <w:p>
+            <w:pPr>
+              <w:spacing w:after="20"/>
+            </w:pPr>
+            <w:r>
+              <w:rPr>
+                <w:rFonts w:ascii="微软雅黑" w:hAnsi="微软雅黑" w:eastAsia="微软雅黑"/>
+                <w:b/>
+                <w:sz w:val="19"/>
+              </w:rPr>
+              <w:t>耗时</w:t>
+            </w:r>
+          </w:p>
+        </w:tc>
+      </w:tr>
+      <w:tr>
+        <w:tc>
+          <w:tcPr>
+            <w:tcW w:type="dxa" w:w="4320"/>
+          </w:tcPr>
+          <w:p>
+            <w:pPr>
+              <w:spacing w:after="20"/>
+            </w:pPr>
+            <w:r>
+              <w:rPr>
+                <w:rFonts w:ascii="微软雅黑" w:hAnsi="微软雅黑" w:eastAsia="微软雅黑"/>
+                <w:b w:val="0"/>
+                <w:sz w:val="19"/>
+              </w:rPr>
+              <w:t>文本 / 编码</w:t>
+            </w:r>
+          </w:p>
+        </w:tc>
+        <w:tc>
+          <w:tcPr>
+            <w:tcW w:type="dxa" w:w="4320"/>
+          </w:tcPr>
+          <w:p>
+            <w:pPr>
+              <w:spacing w:after="20"/>
+            </w:pPr>
+            <w:r>
+              <w:rPr>
+                <w:rFonts w:ascii="微软雅黑" w:hAnsi="微软雅黑" w:eastAsia="微软雅黑"/>
+                <w:b w:val="0"/>
+                <w:sz w:val="19"/>
+              </w:rPr>
+              <w:t>&lt; 1 秒</w:t>
+            </w:r>
+          </w:p>
+        </w:tc>
+      </w:tr>
+      <w:tr>
+        <w:tc>
+          <w:tcPr>
+            <w:tcW w:type="dxa" w:w="4320"/>
+          </w:tcPr>
+          <w:p>
+            <w:pPr>
+              <w:spacing w:after="20"/>
+            </w:pPr>
+            <w:r>
+              <w:rPr>
+                <w:rFonts w:ascii="微软雅黑" w:hAnsi="微软雅黑" w:eastAsia="微软雅黑"/>
+                <w:b w:val="0"/>
+                <w:sz w:val="19"/>
+              </w:rPr>
+              <w:t>普通截图 PNG（1–2MB）</w:t>
+            </w:r>
+          </w:p>
+        </w:tc>
+        <w:tc>
+          <w:tcPr>
+            <w:tcW w:type="dxa" w:w="4320"/>
+          </w:tcPr>
+          <w:p>
+            <w:pPr>
+              <w:spacing w:after="20"/>
+            </w:pPr>
+            <w:r>
+              <w:rPr>
+                <w:rFonts w:ascii="微软雅黑" w:hAnsi="微软雅黑" w:eastAsia="微软雅黑"/>
+                <w:b w:val="0"/>
+                <w:sz w:val="19"/>
+              </w:rPr>
+              <w:t>3–6 秒</w:t>
+            </w:r>
+          </w:p>
+        </w:tc>
+      </w:tr>
+      <w:tr>
+        <w:tc>
+          <w:tcPr>
+            <w:tcW w:type="dxa" w:w="4320"/>
+          </w:tcPr>
+          <w:p>
+            <w:pPr>
+              <w:spacing w:after="20"/>
+            </w:pPr>
+            <w:r>
+              <w:rPr>
+                <w:rFonts w:ascii="微软雅黑" w:hAnsi="微软雅黑" w:eastAsia="微软雅黑"/>
+                <w:b w:val="0"/>
+                <w:sz w:val="19"/>
+              </w:rPr>
+              <w:t>手机照片 JPEG（4000×3000）</w:t>
+            </w:r>
+          </w:p>
+        </w:tc>
+        <w:tc>
+          <w:tcPr>
+            <w:tcW w:type="dxa" w:w="4320"/>
+          </w:tcPr>
+          <w:p>
+            <w:pPr>
+              <w:spacing w:after="20"/>
+            </w:pPr>
+            <w:r>
+              <w:rPr>
+                <w:rFonts w:ascii="微软雅黑" w:hAnsi="微软雅黑" w:eastAsia="微软雅黑"/>
+                <w:b w:val="0"/>
+                <w:sz w:val="19"/>
+              </w:rPr>
+              <w:t>7–10 秒</w:t>
+            </w:r>
+          </w:p>
+        </w:tc>
+      </w:tr>
+      <w:tr>
+        <w:tc>
+          <w:tcPr>
+            <w:tcW w:type="dxa" w:w="4320"/>
+          </w:tcPr>
+          <w:p>
+            <w:pPr>
+              <w:spacing w:after="20"/>
+            </w:pPr>
+            <w:r>
+              <w:rPr>
+                <w:rFonts w:ascii="微软雅黑" w:hAnsi="微软雅黑" w:eastAsia="微软雅黑"/>
+                <w:b w:val="0"/>
+                <w:sz w:val="19"/>
+              </w:rPr>
+              <w:t>4K 截图 PNG</w:t>
+            </w:r>
+          </w:p>
+        </w:tc>
+        <w:tc>
+          <w:tcPr>
+            <w:tcW w:type="dxa" w:w="4320"/>
+          </w:tcPr>
+          <w:p>
+            <w:pPr>
+              <w:spacing w:after="20"/>
+            </w:pPr>
+            <w:r>
+              <w:rPr>
+                <w:rFonts w:ascii="微软雅黑" w:hAnsi="微软雅黑" w:eastAsia="微软雅黑"/>
+                <w:b w:val="0"/>
+                <w:sz w:val="19"/>
+              </w:rPr>
+              <w:t>8–10 秒</w:t>
+            </w:r>
+          </w:p>
+        </w:tc>
+      </w:tr>
+      <w:tr>
+        <w:tc>
+          <w:tcPr>
+            <w:tcW w:type="dxa" w:w="4320"/>
+          </w:tcPr>
+          <w:p>
+            <w:pPr>
+              <w:spacing w:after="20"/>
+            </w:pPr>
+            <w:r>
+              <w:rPr>
+                <w:rFonts w:ascii="微软雅黑" w:hAnsi="微软雅黑" w:eastAsia="微软雅黑"/>
+                <w:b w:val="0"/>
+                <w:sz w:val="19"/>
+              </w:rPr>
+              <w:t>ZIP（5MB）</w:t>
+            </w:r>
+          </w:p>
+        </w:tc>
+        <w:tc>
+          <w:tcPr>
+            <w:tcW w:type="dxa" w:w="4320"/>
+          </w:tcPr>
+          <w:p>
+            <w:pPr>
+              <w:spacing w:after="20"/>
+            </w:pPr>
+            <w:r>
+              <w:rPr>
+                <w:rFonts w:ascii="微软雅黑" w:hAnsi="微软雅黑" w:eastAsia="微软雅黑"/>
+                <w:b w:val="0"/>
+                <w:sz w:val="19"/>
+              </w:rPr>
+              <w:t>2–3 秒</w:t>
+            </w:r>
+          </w:p>
+        </w:tc>
+      </w:tr>
+      <w:tr>
+        <w:tc>
+          <w:tcPr>
+            <w:tcW w:type="dxa" w:w="4320"/>
+          </w:tcPr>
+          <w:p>
+            <w:pPr>
+              <w:spacing w:after="20"/>
+            </w:pPr>
+            <w:r>
+              <w:rPr>
+                <w:rFonts w:ascii="微软雅黑" w:hAnsi="微软雅黑" w:eastAsia="微软雅黑"/>
+                <w:b w:val="0"/>
+                <w:sz w:val="19"/>
+              </w:rPr>
+              <w:t>PCAP（10MB / 20 万包）</w:t>
+            </w:r>
+          </w:p>
+        </w:tc>
+        <w:tc>
+          <w:tcPr>
+            <w:tcW w:type="dxa" w:w="4320"/>
+          </w:tcPr>
+          <w:p>
+            <w:pPr>
+              <w:spacing w:after="20"/>
+            </w:pPr>
+            <w:r>
+              <w:rPr>
+                <w:rFonts w:ascii="微软雅黑" w:hAnsi="微软雅黑" w:eastAsia="微软雅黑"/>
+                <w:b w:val="0"/>
+                <w:sz w:val="19"/>
+              </w:rPr>
+              <w:t>9–10 秒</w:t>
+            </w:r>
+          </w:p>
+        </w:tc>
+      </w:tr>
+      <w:tr>
+        <w:tc>
+          <w:tcPr>
+            <w:tcW w:type="dxa" w:w="4320"/>
+          </w:tcPr>
+          <w:p>
+            <w:pPr>
+              <w:spacing w:after="20"/>
+            </w:pPr>
+            <w:r>
+              <w:rPr>
+                <w:rFonts w:ascii="微软雅黑" w:hAnsi="微软雅黑" w:eastAsia="微软雅黑"/>
+                <w:b w:val="0"/>
+                <w:sz w:val="19"/>
+              </w:rPr>
+              <w:t>exe（3MB）</w:t>
+            </w:r>
+          </w:p>
+        </w:tc>
+        <w:tc>
+          <w:tcPr>
+            <w:tcW w:type="dxa" w:w="4320"/>
+          </w:tcPr>
+          <w:p>
+            <w:pPr>
+              <w:spacing w:after="20"/>
+            </w:pPr>
+            <w:r>
+              <w:rPr>
+                <w:rFonts w:ascii="微软雅黑" w:hAnsi="微软雅黑" w:eastAsia="微软雅黑"/>
+                <w:b w:val="0"/>
+                <w:sz w:val="19"/>
+              </w:rPr>
+              <w:t>4–5 秒</w:t>
+            </w:r>
+          </w:p>
+        </w:tc>
+      </w:tr>
+      <w:tr>
+        <w:tc>
+          <w:tcPr>
+            <w:tcW w:type="dxa" w:w="4320"/>
+          </w:tcPr>
+          <w:p>
+            <w:pPr>
+              <w:spacing w:after="20"/>
+            </w:pPr>
+            <w:r>
+              <w:rPr>
+                <w:rFonts w:ascii="微软雅黑" w:hAnsi="微软雅黑" w:eastAsia="微软雅黑"/>
+                <w:b w:val="0"/>
+                <w:sz w:val="19"/>
+              </w:rPr>
+              <w:t>exe（26MB）</w:t>
+            </w:r>
+          </w:p>
+        </w:tc>
+        <w:tc>
+          <w:tcPr>
+            <w:tcW w:type="dxa" w:w="4320"/>
+          </w:tcPr>
+          <w:p>
+            <w:pPr>
+              <w:spacing w:after="20"/>
+            </w:pPr>
+            <w:r>
+              <w:rPr>
+                <w:rFonts w:ascii="微软雅黑" w:hAnsi="微软雅黑" w:eastAsia="微软雅黑"/>
+                <w:b w:val="0"/>
+                <w:sz w:val="19"/>
+              </w:rPr>
+              <w:t>20–25 秒</w:t>
+            </w:r>
+          </w:p>
+        </w:tc>
+      </w:tr>
+    </w:tbl>
+    <w:p/>
+    <w:p/>
+    <w:p>
+      <w:pPr>
+        <w:spacing w:after="40"/>
+        <w:ind w:left="340"/>
+      </w:pPr>
+      <w:r>
+        <w:rPr>
+          <w:rFonts w:ascii="微软雅黑" w:hAnsi="微软雅黑" w:eastAsia="微软雅黑"/>
+          <w:b w:val="0"/>
+          <w:i/>
+          <w:color w:val="555555"/>
+          <w:sz w:val="21"/>
+        </w:rPr>
+        <w:t>如果某道题明显超出上表很多，多半是文件结构异常（超大 PE、畸形压缩包）。</w:t>
+      </w:r>
+    </w:p>
+    <w:p>
+      <w:pPr>
+        <w:spacing w:after="40"/>
+        <w:ind w:left="340"/>
+      </w:pPr>
+      <w:r>
+        <w:rPr>
+          <w:rFonts w:ascii="微软雅黑" w:hAnsi="微软雅黑" w:eastAsia="微软雅黑"/>
+          <w:b w:val="0"/>
+          <w:i/>
+          <w:color w:val="555555"/>
+          <w:sz w:val="21"/>
+        </w:rPr>
+        <w:t>点停止，改用分类型面板，或者用「⑨ 十六进制」面板手动翻。</w:t>
+      </w:r>
+    </w:p>
     <w:p/>
     <w:p>
       <w:pPr>

</xml_diff>

<commit_message>
chore: 同步 core/stego.py, core/misc.py, core/stego_matrix_test.py, 使用说明.md, 使用说明.docx, 启动网页版.bat
</commit_message>
<xml_diff>
--- a/使用说明.docx
+++ b/使用说明.docx
@@ -7366,7 +7366,190 @@
           <w:b w:val="0"/>
           <w:sz w:val="21"/>
         </w:rPr>
-        <w:t>PNG / JPG / GIF / BMP 都支持。</w:t>
+        <w:t>PNG / JPG / GIF / BMP 都支持。二维码铺满整张图、没有静区也能扫</w:t>
+      </w:r>
+    </w:p>
+    <w:p>
+      <w:pPr>
+        <w:spacing w:after="60"/>
+      </w:pPr>
+      <w:r>
+        <w:rPr>
+          <w:rFonts w:ascii="微软雅黑" w:hAnsi="微软雅黑" w:eastAsia="微软雅黑"/>
+          <w:b w:val="0"/>
+          <w:sz w:val="21"/>
+        </w:rPr>
+        <w:t>（工具会自动补白边，并试 1x/2x/3x 三个倍数 —— 有的码放大反而扫不出）。</w:t>
+      </w:r>
+    </w:p>
+    <w:p/>
+    <w:p>
+      <w:pPr>
+        <w:spacing w:after="60"/>
+      </w:pPr>
+      <w:r>
+        <w:rPr>
+          <w:rFonts w:ascii="微软雅黑" w:hAnsi="微软雅黑" w:eastAsia="微软雅黑"/>
+          <w:b/>
+          <w:sz w:val="21"/>
+        </w:rPr>
+        <w:t>★ GIF 每帧一个二维码？自动逐帧扫再拼起来</w:t>
+      </w:r>
+      <w:r>
+        <w:rPr>
+          <w:rFonts w:ascii="微软雅黑" w:hAnsi="微软雅黑" w:eastAsia="微软雅黑"/>
+          <w:b w:val="0"/>
+          <w:sz w:val="21"/>
+        </w:rPr>
+        <w:t>：有些题把 flag 拆成十几个字符，</w:t>
+      </w:r>
+    </w:p>
+    <w:p>
+      <w:pPr>
+        <w:spacing w:after="60"/>
+      </w:pPr>
+      <w:r>
+        <w:rPr>
+          <w:rFonts w:ascii="微软雅黑" w:hAnsi="微软雅黑" w:eastAsia="微软雅黑"/>
+          <w:b w:val="0"/>
+          <w:sz w:val="21"/>
+        </w:rPr>
+        <w:t>每帧画一个只存 1 个字符的二维码，必须逐帧解再按顺序拼。工具会：</w:t>
+      </w:r>
+    </w:p>
+    <w:p/>
+    <w:p>
+      <w:pPr>
+        <w:pStyle w:val="ListNumber"/>
+        <w:spacing w:after="20"/>
+      </w:pPr>
+      <w:r>
+        <w:rPr>
+          <w:rFonts w:ascii="微软雅黑" w:hAnsi="微软雅黑" w:eastAsia="微软雅黑"/>
+          <w:b w:val="0"/>
+          <w:sz w:val="21"/>
+        </w:rPr>
+        <w:t>拆帧（用 PIL 按帧尺寸还原，不是按逻辑画布裁 —— 有的题故意把画布改小）</w:t>
+      </w:r>
+    </w:p>
+    <w:p>
+      <w:pPr>
+        <w:pStyle w:val="ListNumber"/>
+        <w:spacing w:after="20"/>
+      </w:pPr>
+      <w:r>
+        <w:rPr>
+          <w:rFonts w:ascii="微软雅黑" w:hAnsi="微软雅黑" w:eastAsia="微软雅黑"/>
+          <w:b w:val="0"/>
+          <w:sz w:val="21"/>
+        </w:rPr>
+        <w:t>逐帧扫二维码（pyzbar 三个倍数 + OpenCV 兜底）</w:t>
+      </w:r>
+    </w:p>
+    <w:p>
+      <w:pPr>
+        <w:pStyle w:val="ListNumber"/>
+        <w:spacing w:after="20"/>
+      </w:pPr>
+      <w:r>
+        <w:rPr>
+          <w:rFonts w:ascii="微软雅黑" w:hAnsi="微软雅黑" w:eastAsia="微软雅黑"/>
+          <w:b w:val="0"/>
+          <w:sz w:val="21"/>
+        </w:rPr>
+        <w:t>每帧只有 1~2 个字符时，按帧序拼接，拼出来是 flag 就直接报</w:t>
+      </w:r>
+    </w:p>
+    <w:p/>
+    <w:p>
+      <w:pPr>
+        <w:spacing w:after="60"/>
+      </w:pPr>
+      <w:r>
+        <w:rPr>
+          <w:rFonts w:ascii="微软雅黑" w:hAnsi="微软雅黑" w:eastAsia="微软雅黑"/>
+          <w:b w:val="0"/>
+          <w:sz w:val="21"/>
+        </w:rPr>
+        <w:t>如果有帧没解出，会明确写「第 N 帧没解出，拼接结果可能不完整」，</w:t>
+      </w:r>
+    </w:p>
+    <w:p>
+      <w:pPr>
+        <w:spacing w:after="60"/>
+      </w:pPr>
+      <w:r>
+        <w:rPr>
+          <w:rFonts w:ascii="微软雅黑" w:hAnsi="微软雅黑" w:eastAsia="微软雅黑"/>
+          <w:b/>
+          <w:sz w:val="21"/>
+        </w:rPr>
+        <w:t>不会给你一个少字符但看起来像 flag 的结果</w:t>
+      </w:r>
+      <w:r>
+        <w:rPr>
+          <w:rFonts w:ascii="微软雅黑" w:hAnsi="微软雅黑" w:eastAsia="微软雅黑"/>
+          <w:b w:val="0"/>
+          <w:sz w:val="21"/>
+        </w:rPr>
+        <w:t>。</w:t>
+      </w:r>
+    </w:p>
+    <w:p/>
+    <w:p>
+      <w:pPr>
+        <w:spacing w:after="40"/>
+        <w:ind w:left="340"/>
+      </w:pPr>
+      <w:r>
+        <w:rPr>
+          <w:rFonts w:ascii="微软雅黑" w:hAnsi="微软雅黑" w:eastAsia="微软雅黑"/>
+          <w:b w:val="0"/>
+          <w:i/>
+          <w:color w:val="555555"/>
+          <w:sz w:val="21"/>
+        </w:rPr>
+        <w:t xml:space="preserve">实测 </w:t>
+      </w:r>
+      <w:r>
+        <w:rPr>
+          <w:rFonts w:ascii="Consolas" w:hAnsi="Consolas" w:eastAsia="Consolas"/>
+          <w:b w:val="0"/>
+          <w:i/>
+          <w:color w:val="C7254E"/>
+          <w:sz w:val="19"/>
+        </w:rPr>
+        <w:t>masterGO.gif</w:t>
+      </w:r>
+      <w:r>
+        <w:rPr>
+          <w:rFonts w:ascii="微软雅黑" w:hAnsi="微软雅黑" w:eastAsia="微软雅黑"/>
+          <w:b w:val="0"/>
+          <w:i/>
+          <w:color w:val="555555"/>
+          <w:sz w:val="21"/>
+        </w:rPr>
+        <w:t xml:space="preserve">（18 帧，画布被改成 280×100）→ </w:t>
+      </w:r>
+      <w:r>
+        <w:rPr>
+          <w:rFonts w:ascii="Consolas" w:hAnsi="Consolas" w:eastAsia="Consolas"/>
+          <w:b w:val="0"/>
+          <w:i/>
+          <w:color w:val="C7254E"/>
+          <w:sz w:val="19"/>
+        </w:rPr>
+        <w:t>SYC{F1aSh_so_f4sT}</w:t>
+      </w:r>
+      <w:r>
+        <w:rPr>
+          <w:rFonts w:ascii="微软雅黑" w:hAnsi="微软雅黑" w:eastAsia="微软雅黑"/>
+          <w:b w:val="0"/>
+          <w:i/>
+          <w:color w:val="555555"/>
+          <w:sz w:val="21"/>
+        </w:rPr>
+        <w:t>，1.9 秒。</w:t>
       </w:r>
     </w:p>
     <w:p/>

</xml_diff>

<commit_message>
chore: 同步 build_package.py, 使用说明.md, 使用说明.docx
</commit_message>
<xml_diff>
--- a/使用说明.docx
+++ b/使用说明.docx
@@ -1245,6 +1245,182 @@
           <w:sz w:val="21"/>
         </w:rPr>
         <w:t>赛前把文件夹加进白名单</w:t>
+      </w:r>
+    </w:p>
+    <w:p/>
+    <w:p>
+      <w:pPr>
+        <w:spacing w:after="60"/>
+      </w:pPr>
+      <w:r>
+        <w:rPr>
+          <w:rFonts w:ascii="微软雅黑" w:hAnsi="微软雅黑" w:eastAsia="微软雅黑"/>
+          <w:b/>
+          <w:sz w:val="21"/>
+        </w:rPr>
+        <w:t>★ 只认这个 exe：</w:t>
+      </w:r>
+      <w:r>
+        <w:rPr>
+          <w:rFonts w:ascii="Consolas" w:hAnsi="Consolas" w:eastAsia="Consolas"/>
+          <w:b/>
+          <w:color w:val="C7254E"/>
+          <w:sz w:val="19"/>
+        </w:rPr>
+        <w:t>dist\FlagRush\FlagRush.exe</w:t>
+      </w:r>
+      <w:r>
+        <w:rPr>
+          <w:rFonts w:ascii="微软雅黑" w:hAnsi="微软雅黑" w:eastAsia="微软雅黑"/>
+          <w:b/>
+          <w:sz w:val="21"/>
+        </w:rPr>
+        <w:t xml:space="preserve">（或你拷贝出来那一份，旁边必须有 </w:t>
+      </w:r>
+      <w:r>
+        <w:rPr>
+          <w:rFonts w:ascii="Consolas" w:hAnsi="Consolas" w:eastAsia="Consolas"/>
+          <w:b/>
+          <w:color w:val="C7254E"/>
+          <w:sz w:val="19"/>
+        </w:rPr>
+        <w:t>_internal</w:t>
+      </w:r>
+      <w:r>
+        <w:rPr>
+          <w:rFonts w:ascii="微软雅黑" w:hAnsi="微软雅黑" w:eastAsia="微软雅黑"/>
+          <w:b/>
+          <w:sz w:val="21"/>
+        </w:rPr>
+        <w:t>）。</w:t>
+      </w:r>
+    </w:p>
+    <w:p/>
+    <w:p>
+      <w:pPr>
+        <w:spacing w:after="60"/>
+      </w:pPr>
+      <w:r>
+        <w:rPr>
+          <w:rFonts w:ascii="微软雅黑" w:hAnsi="微软雅黑" w:eastAsia="微软雅黑"/>
+          <w:b w:val="0"/>
+          <w:sz w:val="21"/>
+        </w:rPr>
+        <w:t xml:space="preserve">源码目录里还有一个 </w:t>
+      </w:r>
+      <w:r>
+        <w:rPr>
+          <w:rFonts w:ascii="Consolas" w:hAnsi="Consolas" w:eastAsia="Consolas"/>
+          <w:b w:val="0"/>
+          <w:color w:val="C7254E"/>
+          <w:sz w:val="19"/>
+        </w:rPr>
+        <w:t>build\FlagRush\FlagRush.exe</w:t>
+      </w:r>
+      <w:r>
+        <w:rPr>
+          <w:rFonts w:ascii="微软雅黑" w:hAnsi="微软雅黑" w:eastAsia="微软雅黑"/>
+          <w:b w:val="0"/>
+          <w:sz w:val="21"/>
+        </w:rPr>
+        <w:t>，那是 PyInstaller 的</w:t>
+      </w:r>
+      <w:r>
+        <w:rPr>
+          <w:rFonts w:ascii="微软雅黑" w:hAnsi="微软雅黑" w:eastAsia="微软雅黑"/>
+          <w:b/>
+          <w:sz w:val="21"/>
+        </w:rPr>
+        <w:t>中间产物</w:t>
+      </w:r>
+      <w:r>
+        <w:rPr>
+          <w:rFonts w:ascii="微软雅黑" w:hAnsi="微软雅黑" w:eastAsia="微软雅黑"/>
+          <w:b w:val="0"/>
+          <w:sz w:val="21"/>
+        </w:rPr>
+        <w:t>：</w:t>
+      </w:r>
+    </w:p>
+    <w:p>
+      <w:pPr>
+        <w:spacing w:after="60"/>
+      </w:pPr>
+      <w:r>
+        <w:rPr>
+          <w:rFonts w:ascii="微软雅黑" w:hAnsi="微软雅黑" w:eastAsia="微软雅黑"/>
+          <w:b w:val="0"/>
+          <w:sz w:val="21"/>
+        </w:rPr>
+        <w:t>它和 dist 里那个内容完全一样（MD5 相同），但</w:t>
+      </w:r>
+      <w:r>
+        <w:rPr>
+          <w:rFonts w:ascii="微软雅黑" w:hAnsi="微软雅黑" w:eastAsia="微软雅黑"/>
+          <w:b/>
+          <w:sz w:val="21"/>
+        </w:rPr>
+        <w:t xml:space="preserve">没有配套的 </w:t>
+      </w:r>
+      <w:r>
+        <w:rPr>
+          <w:rFonts w:ascii="Consolas" w:hAnsi="Consolas" w:eastAsia="Consolas"/>
+          <w:b/>
+          <w:color w:val="C7254E"/>
+          <w:sz w:val="19"/>
+        </w:rPr>
+        <w:t>_internal</w:t>
+      </w:r>
+      <w:r>
+        <w:rPr>
+          <w:rFonts w:ascii="微软雅黑" w:hAnsi="微软雅黑" w:eastAsia="微软雅黑"/>
+          <w:b w:val="0"/>
+          <w:sz w:val="21"/>
+        </w:rPr>
+        <w:t>，</w:t>
+      </w:r>
+    </w:p>
+    <w:p>
+      <w:pPr>
+        <w:spacing w:after="60"/>
+      </w:pPr>
+      <w:r>
+        <w:rPr>
+          <w:rFonts w:ascii="微软雅黑" w:hAnsi="微软雅黑" w:eastAsia="微软雅黑"/>
+          <w:b w:val="0"/>
+          <w:sz w:val="21"/>
+        </w:rPr>
+        <w:t>双击连报错框都不弹、完全静默无反应 —— 很容易被当成「程序坏了」。</w:t>
+      </w:r>
+    </w:p>
+    <w:p>
+      <w:pPr>
+        <w:spacing w:after="60"/>
+      </w:pPr>
+      <w:r>
+        <w:rPr>
+          <w:rFonts w:ascii="微软雅黑" w:hAnsi="微软雅黑" w:eastAsia="微软雅黑"/>
+          <w:b w:val="0"/>
+          <w:sz w:val="21"/>
+        </w:rPr>
+        <w:t xml:space="preserve">新版打包脚本会在打包完自动删掉 </w:t>
+      </w:r>
+      <w:r>
+        <w:rPr>
+          <w:rFonts w:ascii="Consolas" w:hAnsi="Consolas" w:eastAsia="Consolas"/>
+          <w:b w:val="0"/>
+          <w:color w:val="C7254E"/>
+          <w:sz w:val="19"/>
+        </w:rPr>
+        <w:t>build\</w:t>
+      </w:r>
+      <w:r>
+        <w:rPr>
+          <w:rFonts w:ascii="微软雅黑" w:hAnsi="微软雅黑" w:eastAsia="微软雅黑"/>
+          <w:b w:val="0"/>
+          <w:sz w:val="21"/>
+        </w:rPr>
+        <w:t>；如果你手上那份还有，直接删掉即可，不影响任何功能。</w:t>
       </w:r>
     </w:p>
     <w:p>

</xml_diff>